<commit_message>
fix(server): ensure signature lines are adjacent with zero paragraph spacing
</commit_message>
<xml_diff>
--- a/templates/รายงาน2356.docx
+++ b/templates/รายงาน2356.docx
@@ -1992,7 +1992,6 @@
     <w:p>
       <w:pPr>
         <w:spacing w:line="18pt" w:lineRule="auto"/>
-        <w:jc w:val="thaiDistribute"/>
         <w:rPr>
           <w:rFonts w:ascii="TH SarabunIT๙" w:hAnsi="TH SarabunIT๙" w:cs="TH SarabunIT๙"/>
           <w:sz w:val="34"/>
@@ -2016,7 +2015,6 @@
         </w:tabs>
         <w:spacing w:line="18pt" w:lineRule="auto"/>
         <w:ind w:firstLine="72pt"/>
-        <w:jc w:val="thaiDistribute"/>
         <w:rPr>
           <w:rFonts w:ascii="TH SarabunIT๙" w:hAnsi="TH SarabunIT๙" w:cs="TH SarabunIT๙"/>
           <w:sz w:val="34"/>
@@ -2030,6 +2028,24 @@
           <w:szCs w:val="34"/>
         </w:rPr>
         <w:t>{{.}}</w:t>
+      </w:r>
+    </w:p>
+    <w:p>
+      <w:pPr>
+        <w:spacing w:line="18pt" w:lineRule="auto"/>
+        <w:rPr>
+          <w:rFonts w:ascii="TH SarabunIT๙" w:hAnsi="TH SarabunIT๙" w:cs="TH SarabunIT๙"/>
+          <w:sz w:val="34"/>
+          <w:szCs w:val="34"/>
+        </w:rPr>
+      </w:pPr>
+      <w:r>
+        <w:rPr>
+          <w:rFonts w:ascii="TH SarabunIT๙" w:hAnsi="TH SarabunIT๙" w:cs="TH SarabunIT๙"/>
+          <w:sz w:val="34"/>
+          <w:szCs w:val="34"/>
+        </w:rPr>
+        <w:t>{{/paragraphs}}</w:t>
       </w:r>
     </w:p>
     <w:p>
@@ -2040,17 +2056,31 @@
           <w:rFonts w:ascii="TH SarabunIT๙" w:hAnsi="TH SarabunIT๙" w:cs="TH SarabunIT๙"/>
           <w:sz w:val="34"/>
           <w:szCs w:val="34"/>
-          <w:cs/>
         </w:rPr>
       </w:pPr>
-      <w:r>
-        <w:rPr>
-          <w:rFonts w:ascii="TH SarabunIT๙" w:hAnsi="TH SarabunIT๙" w:cs="TH SarabunIT๙"/>
-          <w:sz w:val="34"/>
-          <w:szCs w:val="34"/>
-        </w:rPr>
-        <w:t>{{/paragraphs}}</w:t>
-      </w:r>
+    </w:p>
+    <w:p>
+      <w:pPr>
+        <w:spacing w:line="18pt" w:lineRule="auto"/>
+        <w:jc w:val="thaiDistribute"/>
+        <w:rPr>
+          <w:rFonts w:ascii="TH SarabunIT๙" w:hAnsi="TH SarabunIT๙" w:cs="TH SarabunIT๙"/>
+          <w:sz w:val="34"/>
+          <w:szCs w:val="34"/>
+        </w:rPr>
+      </w:pPr>
+    </w:p>
+    <w:p>
+      <w:pPr>
+        <w:spacing w:line="18pt" w:lineRule="auto"/>
+        <w:jc w:val="thaiDistribute"/>
+        <w:rPr>
+          <w:rFonts w:ascii="TH SarabunIT๙" w:hAnsi="TH SarabunIT๙" w:cs="TH SarabunIT๙"/>
+          <w:sz w:val="34"/>
+          <w:szCs w:val="34"/>
+          <w:cs/>
+        </w:rPr>
+      </w:pPr>
     </w:p>
     <w:p>
       <w:pPr>
@@ -2658,6 +2688,7 @@
   <w:style w:type="character" w:default="1" w:styleId="DefaultParagraphFont">
     <w:name w:val="Default Paragraph Font"/>
     <w:uiPriority w:val="1"/>
+    <w:semiHidden/>
     <w:unhideWhenUsed/>
   </w:style>
   <w:style w:type="table" w:default="1" w:styleId="TableNormal">

</xml_diff>